<commit_message>
Prepare for public release
Adds a public/internal split ahead of sharing the repo. Everything tracked is now treated as public. Internal/ is gitignored and blocked by a pre-commit hook.

Also logs the Innovate UK research pass (RESEARCH_LOG 043-046) and the rebuilt AI Skills Hub briefing. The white paper's own guidance contradicts the platform it promotes, and BridgeAI reports 1,700 course completions after three years and £74.6m allocated.
</commit_message>
<xml_diff>
--- a/drafts/AI_Skills_Hub_Briefing.docx
+++ b/drafts/AI_Skills_Hub_Briefing.docx
@@ -17,12 +17,6 @@
         <w:gridCol w:w="5546"/>
       </w:tblGrid>
       <w:tr>
-        <w:tblPrEx>
-          <w:tblCellMar>
-            <w:top w:w="0" w:type="dxa"/>
-            <w:bottom w:w="0" w:type="dxa"/>
-          </w:tblCellMar>
-        </w:tblPrEx>
         <w:tc>
           <w:tcPr>
             <w:tcW w:w="4200" w:type="dxa"/>
@@ -162,7 +156,7 @@
         <w:pStyle w:val="Heading2"/>
       </w:pPr>
       <w:r>
-        <w:t>Overview</w:t>
+        <w:t>Overview/Editorial</w:t>
       </w:r>
     </w:p>
     <w:p>
@@ -170,139 +164,15 @@
         <w:spacing w:after="280"/>
       </w:pPr>
       <w:r>
-        <w:t>The UK Government's AI Skills Hub</w:t>
-      </w:r>
-      <w:r>
-        <w:t xml:space="preserve"> is</w:t>
-      </w:r>
-      <w:r>
-        <w:t xml:space="preserve"> a national </w:t>
-      </w:r>
-      <w:r>
-        <w:t xml:space="preserve">learning </w:t>
-      </w:r>
-      <w:r>
-        <w:t>platform under Innovate UK and Skills England</w:t>
-      </w:r>
-      <w:r>
-        <w:t>, delivered by</w:t>
-      </w:r>
-      <w:r>
-        <w:t xml:space="preserve"> </w:t>
-      </w:r>
-      <w:r>
-        <w:t>PwC and industry partners</w:t>
-      </w:r>
-      <w:r>
-        <w:t>.</w:t>
-      </w:r>
-      <w:r>
-        <w:t xml:space="preserve"> </w:t>
-      </w:r>
-      <w:r>
-        <w:t>Th</w:t>
-      </w:r>
-      <w:r>
-        <w:t xml:space="preserve">e scope of this </w:t>
-      </w:r>
-      <w:r>
-        <w:t xml:space="preserve">initiative </w:t>
-      </w:r>
-      <w:r>
-        <w:t xml:space="preserve">expanded in January 2026 </w:t>
-      </w:r>
-      <w:r>
-        <w:t xml:space="preserve">to </w:t>
-      </w:r>
-      <w:r>
-        <w:t xml:space="preserve">encompass </w:t>
-      </w:r>
-      <w:r>
-        <w:t>all</w:t>
-      </w:r>
-      <w:r>
-        <w:t xml:space="preserve"> UK adults</w:t>
-      </w:r>
-      <w:r>
-        <w:t>,</w:t>
-      </w:r>
-      <w:r>
-        <w:t xml:space="preserve"> with an ambition to upskill 10 million workers by 2030</w:t>
-      </w:r>
-      <w:r>
-        <w:t xml:space="preserve">. This </w:t>
-      </w:r>
-      <w:r>
-        <w:t xml:space="preserve">could almost pass as a </w:t>
-      </w:r>
-      <w:r>
-        <w:t>proactive</w:t>
-      </w:r>
-      <w:r>
-        <w:t xml:space="preserve">, uncharacteristically shrewd </w:t>
-      </w:r>
-      <w:r>
-        <w:t>move from the government</w:t>
-      </w:r>
-      <w:r>
-        <w:t xml:space="preserve">. Almost. </w:t>
-      </w:r>
-      <w:r>
-        <w:t>T</w:t>
-      </w:r>
-      <w:r>
-        <w:t>here is a fundamental and independently corroborated flaw in the skills hub:</w:t>
-      </w:r>
-      <w:r>
-        <w:t xml:space="preserve"> </w:t>
-      </w:r>
-      <w:r>
-        <w:t>it functions as a directory of pre-existing courses organised by technology vendor, not a structured programme mapped to the competencies employers actually need.</w:t>
-      </w:r>
-      <w:r>
-        <w:t xml:space="preserve"> If the government wants anything close to the proposed ‘1 in 7 people’ in the country using this tool, they’ll have to do better than vaguely pointing at a disjointed library of existing proprietary courses.</w:t>
-      </w:r>
-      <w:r>
-        <w:t xml:space="preserve"> An LSE academic analysis and two commercial reviewers test</w:t>
-      </w:r>
-      <w:r>
-        <w:t>ed</w:t>
-      </w:r>
-      <w:r>
-        <w:t xml:space="preserve"> the platform separately, converg</w:t>
-      </w:r>
-      <w:r>
-        <w:t>ing</w:t>
-      </w:r>
-      <w:r>
-        <w:t xml:space="preserve"> on the same gaps: no competency mapping, no diagnostic-driven sequencing, no embedded practice, no support for organisational readiness. </w:t>
-      </w:r>
-      <w:r>
-        <w:t xml:space="preserve">Conversely, the </w:t>
-      </w:r>
-      <w:r>
-        <w:t xml:space="preserve">direction </w:t>
-      </w:r>
-      <w:r>
-        <w:t>suggested here</w:t>
-      </w:r>
-      <w:r>
-        <w:t xml:space="preserve"> </w:t>
-      </w:r>
-      <w:r>
-        <w:t>is grounded in existing research rather than invented from scratch</w:t>
-      </w:r>
-      <w:r>
-        <w:t>.</w:t>
-      </w:r>
-      <w:r>
-        <w:t xml:space="preserve"> </w:t>
-      </w:r>
-      <w:r>
-        <w:t>T</w:t>
-      </w:r>
-      <w:r>
-        <w:t>he same government programme that diagnosed the UK's AI skills gap has already published PRIMES, a framework describing evidence-informed training principles, Finland's Elements of AI shows a coherent, non-directory approach can reach millions without a large budget. Grounded AI Practice, an evidence-led research project, is using this gap to inform its own first practical output — detailed in §6.</w:t>
+        <w:t xml:space="preserve">The UK Government's AI Skills Hub is a national learning platform under Innovate UK and Skills England, delivered by PwC and industry partners. The scope of this initiative expanded in January 2026 to encompass all UK adults, with an ambition to upskill 10 million workers by 2030. This could almost pass as a proactive, uncharacteristically shrewd move from the government. Almost. There is a fundamental, independently corroborated flaw in the skills hub: it functions as a directory of pre-existing courses organised by technology vendor, not a structured programme mapped to the competencies employers and individuals actually need. If the government wants anything close to the proposed ‘1 in 7 people’ in the country using this tool, they’ll have to do better than vaguely pointing at a disjointed library of existing proprietary courses. An LSE academic analysis and two commercial reviewers tested the platform separately, converging on the same gaps: no competency mapping, no diagnostic-driven sequencing, no embedded practice, no support for organisational readiness. </w:t>
+      </w:r>
+    </w:p>
+    <w:p>
+      <w:pPr>
+        <w:spacing w:after="280"/>
+      </w:pPr>
+      <w:r>
+        <w:t xml:space="preserve">The direction suggested here is grounded in existing research rather than invented from scratch. The same government programme that diagnosed the UK's AI skills gap has now published PRIMES, a framework describing evidence-informed training principles. Comparing the AI Skills hub platform against the PRIMES framework, reasonable conclusions can be made that the platform is at best ineffective, and at times directly contradictory to guidance. [institutional disconnect/lack of understanding argument here or in later section?]</w:t>
       </w:r>
     </w:p>
     <w:p>
@@ -315,18 +185,12 @@
     </w:p>
     <w:p>
       <w:r>
-        <w:t>The AI Skills Hub is a national training-navigation platform delivered under the BridgeAI programme</w:t>
-      </w:r>
-      <w:r>
-        <w:t>.</w:t>
-      </w:r>
-      <w:r>
-        <w:t>, developed by Innovate UK in partnership with Skills England. Initially focused on four sectors, it was expanded on 28 January 2026 to all UK adults, with a stated ambition to upskill 10 million workers by 2030 and a reported £4.1 million investment.</w:t>
-      </w:r>
-    </w:p>
-    <w:p>
-      <w:r>
-        <w:t>The core critique, detailed below, is structural rather than about content quality: the platform curates existing third-party courses but does not sequence them against a competency framework, personalise pathways to a learner's actual level, or provide embedded practice. Reviewers characterise it as “a directory, not a programme.”</w:t>
+        <w:t xml:space="preserve">The AI Skills Hub is a national training-navigation platform delivered under the BridgeAI programme, developed by Innovate UK in partnership with Skills England. It initially focused on four sectors. On 28 January 2026 it expanded to all UK adults, with a stated ambition to upskill 10 million workers by 2030 and a reported £4.1 million investment.</w:t>
+      </w:r>
+    </w:p>
+    <w:p>
+      <w:r>
+        <w:t>The core critique is structural, not about content quality: the platform curates existing third-party courses, but it doesn't sequence them against a competency framework, personalise pathways, or provide embedded practice. Reviewers call it “a directory, not a programme.”</w:t>
       </w:r>
     </w:p>
     <w:p>
@@ -364,13 +228,8 @@
         <w:spacing w:before="120"/>
       </w:pPr>
       <w:r>
-        <w:rPr>
-          <w:noProof/>
-        </w:rPr>
-      </w:r>
-      <w:r>
         <w:pict w14:anchorId="6D6C13F5">
-          <v:group id="Pull quote" o:spid="_x0000_s1032" style="width:480.3pt;height:80.3pt;mso-position-horizontal-relative:char;mso-position-vertical-relative:line" coordsize="61000,10200" o:gfxdata="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">
+          <v:group id="Pull quote" o:spid="_x0000_s1032" style="width:480.3pt;height:80.3pt;mso-position-horizontal-relative:char;mso-position-vertical-relative:line" coordsize="61000,10200">
             <v:roundrect id="Rectangle: Rounded Corners 1419382168" o:spid="_x0000_s1033" style="position:absolute;width:576;height:10200;visibility:visible;mso-wrap-style:square;v-text-anchor:top" arcsize=".5" o:gfxdata="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" fillcolor="#f15e4b" stroked="f"/>
             <v:rect id="Rectangle 1616996374" o:spid="_x0000_s1034" style="position:absolute;left:2736;width:58264;height:10200;visibility:visible;mso-wrap-style:square;v-text-anchor:middle" o:gfxdata="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" filled="f" stroked="f">
               <v:textbox inset="0,0,0,0">
@@ -427,12 +286,6 @@
         <w:gridCol w:w="5146"/>
       </w:tblGrid>
       <w:tr>
-        <w:tblPrEx>
-          <w:tblCellMar>
-            <w:top w:w="0" w:type="dxa"/>
-            <w:bottom w:w="0" w:type="dxa"/>
-          </w:tblCellMar>
-        </w:tblPrEx>
         <w:tc>
           <w:tcPr>
             <w:tcW w:w="2700" w:type="dxa"/>
@@ -540,12 +393,6 @@
         </w:tc>
       </w:tr>
       <w:tr>
-        <w:tblPrEx>
-          <w:tblCellMar>
-            <w:top w:w="0" w:type="dxa"/>
-            <w:bottom w:w="0" w:type="dxa"/>
-          </w:tblCellMar>
-        </w:tblPrEx>
         <w:tc>
           <w:tcPr>
             <w:tcW w:w="2700" w:type="dxa"/>
@@ -656,12 +503,6 @@
         </w:tc>
       </w:tr>
       <w:tr>
-        <w:tblPrEx>
-          <w:tblCellMar>
-            <w:top w:w="0" w:type="dxa"/>
-            <w:bottom w:w="0" w:type="dxa"/>
-          </w:tblCellMar>
-        </w:tblPrEx>
         <w:tc>
           <w:tcPr>
             <w:tcW w:w="2700" w:type="dxa"/>
@@ -691,7 +532,7 @@
                 <w:sz w:val="19"/>
                 <w:szCs w:val="19"/>
               </w:rPr>
-              <w:t>Techosaurus / Quantum Rise</w:t>
+              <w:t xml:space="preserve">Techosaurus / Quantum Rise</w:t>
             </w:r>
           </w:p>
           <w:p>
@@ -772,12 +613,6 @@
         </w:tc>
       </w:tr>
       <w:tr>
-        <w:tblPrEx>
-          <w:tblCellMar>
-            <w:top w:w="0" w:type="dxa"/>
-            <w:bottom w:w="0" w:type="dxa"/>
-          </w:tblCellMar>
-        </w:tblPrEx>
         <w:tc>
           <w:tcPr>
             <w:tcW w:w="2700" w:type="dxa"/>
@@ -893,7 +728,7 @@
         <w:pStyle w:val="Caption"/>
       </w:pPr>
       <w:r>
-        <w:t>Note on interest: two of the three reviewers run commercial AI-training businesses that compete with the platform they reviewed, and are flagged accordingly. Their specific, hands-on structural findings nonetheless align closely with the independent academic critique — the corroboration is across source types, not just repetition of one view. That corroboration covers the broad structural problem; specific figures such as “71% beginner-level material” or the “3/10” rating come from individual reviews, not a replicated evaluation, and should be read as illustrative rather than measured consensus.</w:t>
+        <w:t>Note on interest: two of the three reviewers run commercial AI-training businesses that compete with the platform they reviewed, and are flagged accordingly. Their specific, hands-on structural findings nonetheless align closely with the independent academic critique — the corroboration is across source types, not just repetition of one view. That corroboration is about the broad structural problem, not every number. Figures like “71% beginner-level material” or the “3/10” rating come from individual reviews, not a replicated evaluation — read them as illustrative, not as measured consensus.</w:t>
       </w:r>
     </w:p>
     <w:p>
@@ -906,12 +741,12 @@
     </w:p>
     <w:p>
       <w:r>
-        <w:t>The pattern across all three reviews is the same: a library of courses of roughly equal prominence, organised by technology or vendor rather than by skill, with no diagnostic step to route learners to their actual level, no mandated sequencing, and no built-in low-stakes practice environment. One reviewer found that intermediate learners were shown roughly 71% beginner-level content — nearly doubling realistic completion time.</w:t>
-      </w:r>
-    </w:p>
-    <w:p>
-      <w:r>
-        <w:t>The notable irony is that this is not a case of missing evidence. The same government-commissioned research programme (Dr Nisreen Ameen, Royal Holloway, University of London, in partnership with Skills England, drawing on 23 workshops, 10 employer case studies and a 536-response survey) has already published a detailed framework describing evidence-informed principles for more effective AI training — summarised below. No visible competency mapping, diagnostic sequencing or PRIMES alignment was identified in the platform materials the three reviews examined, which supports an inference that the framework was not applied comprehensively to the Hub's design — though none of the three reviewers had access to the Hub's internal design documentation, so this remains an inference from external behaviour, not a confirmed finding.</w:t>
+        <w:t>The pattern across all three reviews is the same: a library of courses, organised by technology or vendor rather than by skill. There's no diagnostic step to route learners to their level, no mandated sequencing, and no built-in low-stakes practice. One reviewer found intermediate learners shown roughly 71% beginner-level content — nearly doubling realistic completion time.</w:t>
+      </w:r>
+    </w:p>
+    <w:p>
+      <w:r>
+        <w:t>The irony is that this isn't a case of missing evidence. The same government-commissioned research programme (Dr Nisreen Ameen, Royal Holloway, University of London, with Skills England — 23 workshops, 10 employer case studies, a 536-response survey) has already published a framework for what effective AI training looks like, summarised below. None of the three reviews found evidence of competency mapping, diagnostic sequencing, or PRIMES alignment on the platform. That's a reasonable basis to infer the framework wasn't applied — though none of the reviewers saw the Hub's internal design documents, so it stays an inference, not a confirmed fact.</w:t>
       </w:r>
     </w:p>
     <w:p>
@@ -954,12 +789,6 @@
         <w:gridCol w:w="7346"/>
       </w:tblGrid>
       <w:tr>
-        <w:tblPrEx>
-          <w:tblCellMar>
-            <w:top w:w="0" w:type="dxa"/>
-            <w:bottom w:w="0" w:type="dxa"/>
-          </w:tblCellMar>
-        </w:tblPrEx>
         <w:trPr>
           <w:cantSplit/>
         </w:trPr>
@@ -1027,12 +856,6 @@
         </w:tc>
       </w:tr>
       <w:tr>
-        <w:tblPrEx>
-          <w:tblCellMar>
-            <w:top w:w="0" w:type="dxa"/>
-            <w:bottom w:w="0" w:type="dxa"/>
-          </w:tblCellMar>
-        </w:tblPrEx>
         <w:trPr>
           <w:cantSplit/>
         </w:trPr>
@@ -1100,12 +923,6 @@
         </w:tc>
       </w:tr>
       <w:tr>
-        <w:tblPrEx>
-          <w:tblCellMar>
-            <w:top w:w="0" w:type="dxa"/>
-            <w:bottom w:w="0" w:type="dxa"/>
-          </w:tblCellMar>
-        </w:tblPrEx>
         <w:trPr>
           <w:cantSplit/>
         </w:trPr>
@@ -1173,12 +990,6 @@
         </w:tc>
       </w:tr>
       <w:tr>
-        <w:tblPrEx>
-          <w:tblCellMar>
-            <w:top w:w="0" w:type="dxa"/>
-            <w:bottom w:w="0" w:type="dxa"/>
-          </w:tblCellMar>
-        </w:tblPrEx>
         <w:trPr>
           <w:cantSplit/>
         </w:trPr>
@@ -1246,12 +1057,6 @@
         </w:tc>
       </w:tr>
       <w:tr>
-        <w:tblPrEx>
-          <w:tblCellMar>
-            <w:top w:w="0" w:type="dxa"/>
-            <w:bottom w:w="0" w:type="dxa"/>
-          </w:tblCellMar>
-        </w:tblPrEx>
         <w:trPr>
           <w:cantSplit/>
         </w:trPr>
@@ -1319,12 +1124,6 @@
         </w:tc>
       </w:tr>
       <w:tr>
-        <w:tblPrEx>
-          <w:tblCellMar>
-            <w:top w:w="0" w:type="dxa"/>
-            <w:bottom w:w="0" w:type="dxa"/>
-          </w:tblCellMar>
-        </w:tblPrEx>
         <w:trPr>
           <w:cantSplit/>
         </w:trPr>
@@ -1491,12 +1290,6 @@
         <w:gridCol w:w="2000"/>
       </w:tblGrid>
       <w:tr>
-        <w:tblPrEx>
-          <w:tblCellMar>
-            <w:top w:w="0" w:type="dxa"/>
-            <w:bottom w:w="0" w:type="dxa"/>
-          </w:tblCellMar>
-        </w:tblPrEx>
         <w:tc>
           <w:tcPr>
             <w:tcW w:w="3200" w:type="dxa"/>
@@ -1568,12 +1361,6 @@
         </w:tc>
       </w:tr>
       <w:tr>
-        <w:tblPrEx>
-          <w:tblCellMar>
-            <w:top w:w="0" w:type="dxa"/>
-            <w:bottom w:w="0" w:type="dxa"/>
-          </w:tblCellMar>
-        </w:tblPrEx>
         <w:tc>
           <w:tcPr>
             <w:tcW w:w="3200" w:type="dxa"/>
@@ -1641,12 +1428,6 @@
         </w:tc>
       </w:tr>
       <w:tr>
-        <w:tblPrEx>
-          <w:tblCellMar>
-            <w:top w:w="0" w:type="dxa"/>
-            <w:bottom w:w="0" w:type="dxa"/>
-          </w:tblCellMar>
-        </w:tblPrEx>
         <w:tc>
           <w:tcPr>
             <w:tcW w:w="3200" w:type="dxa"/>
@@ -1714,12 +1495,6 @@
         </w:tc>
       </w:tr>
       <w:tr>
-        <w:tblPrEx>
-          <w:tblCellMar>
-            <w:top w:w="0" w:type="dxa"/>
-            <w:bottom w:w="0" w:type="dxa"/>
-          </w:tblCellMar>
-        </w:tblPrEx>
         <w:tc>
           <w:tcPr>
             <w:tcW w:w="3200" w:type="dxa"/>
@@ -1787,12 +1562,6 @@
         </w:tc>
       </w:tr>
       <w:tr>
-        <w:tblPrEx>
-          <w:tblCellMar>
-            <w:top w:w="0" w:type="dxa"/>
-            <w:bottom w:w="0" w:type="dxa"/>
-          </w:tblCellMar>
-        </w:tblPrEx>
         <w:tc>
           <w:tcPr>
             <w:tcW w:w="3200" w:type="dxa"/>
@@ -1860,12 +1629,6 @@
         </w:tc>
       </w:tr>
       <w:tr>
-        <w:tblPrEx>
-          <w:tblCellMar>
-            <w:top w:w="0" w:type="dxa"/>
-            <w:bottom w:w="0" w:type="dxa"/>
-          </w:tblCellMar>
-        </w:tblPrEx>
         <w:tc>
           <w:tcPr>
             <w:tcW w:w="3200" w:type="dxa"/>
@@ -1965,7 +1728,7 @@
     </w:p>
     <w:p>
       <w:r>
-        <w:t>Elements of AI, a free course from MinnaLearn and the University of Helsinki, offers a working counter-example: vendor-neutral, requiring no programming or technical prerequisite, structured as six short chapters combining theory, practical exercises and self-reflection, completed at the learner's own pace. It has reportedly reached approximately one million learners globally and is cited by the LSE reviewers as the model the UK's own platform should have followed. This demonstrates reach at scale — it is not, on its own, evidence of measured learning outcomes or workplace capability transfer, which is a different, harder claim than enrolment or completion.</w:t>
+        <w:t xml:space="preserve">Elements of AI, a free course from MinnaLearn and the University of Helsinki, offers a working counter-example: vendor-neutral, requiring no programming or technical prerequisite, structured as six short chapters combining theory, practical exercises and self-reflection, completed at the learner's own pace. It has reportedly reached approximately one million learners globally and is cited by the LSE reviewers as the model the UK's own platform should have followed. That's reach at scale — not proof of learning outcomes. Enrolment and completion are one thing; measured capability transfer into the workplace is a harder, different claim this doesn't establish.</w:t>
       </w:r>
     </w:p>
     <w:p>
@@ -1981,7 +1744,7 @@
         <w:spacing w:after="160"/>
       </w:pPr>
       <w:r>
-        <w:t>Synthesising PRIMES, the platform reviews and the Gradual Release of Responsibility model produces seven provisional design principles for Grounded AI Practice to test, not settled conclusions:</w:t>
+        <w:t>PRIMES, the platform reviews, and the Gradual Release of Responsibility model together suggest seven provisional design principles — starting points for Grounded AI Practice to test, not settled conclusions:</w:t>
       </w:r>
     </w:p>
     <w:p>
@@ -2202,12 +1965,6 @@
         <w:gridCol w:w="7746"/>
       </w:tblGrid>
       <w:tr>
-        <w:tblPrEx>
-          <w:tblCellMar>
-            <w:top w:w="0" w:type="dxa"/>
-            <w:bottom w:w="0" w:type="dxa"/>
-          </w:tblCellMar>
-        </w:tblPrEx>
         <w:trPr>
           <w:cantSplit/>
         </w:trPr>
@@ -2275,12 +2032,6 @@
         </w:tc>
       </w:tr>
       <w:tr>
-        <w:tblPrEx>
-          <w:tblCellMar>
-            <w:top w:w="0" w:type="dxa"/>
-            <w:bottom w:w="0" w:type="dxa"/>
-          </w:tblCellMar>
-        </w:tblPrEx>
         <w:trPr>
           <w:cantSplit/>
         </w:trPr>
@@ -2348,12 +2099,6 @@
         </w:tc>
       </w:tr>
       <w:tr>
-        <w:tblPrEx>
-          <w:tblCellMar>
-            <w:top w:w="0" w:type="dxa"/>
-            <w:bottom w:w="0" w:type="dxa"/>
-          </w:tblCellMar>
-        </w:tblPrEx>
         <w:trPr>
           <w:cantSplit/>
         </w:trPr>
@@ -2428,7 +2173,7 @@
     </w:p>
     <w:p>
       <w:r>
-        <w:t>None of this claims to have solved the design problem documented above; a single pilot unit is a test of an approach, not proof it works. But each of these decisions was made specifically to avoid the failure mode this briefing documents: one small, coherent, well-sequenced unit — not a library of loosely-connected content — is the more direct test of whether a “programme, not a directory” approach can work at a much smaller scale than the Hub's £4.1 million platform.</w:t>
+        <w:t>None of this claims to have solved the problem above. A single pilot unit tests an approach; it doesn't prove one works. But each decision was made to dodge the exact failure mode this briefing documents — one small, well-sequenced unit is a more direct test than a library of loosely-connected content ever could be.</w:t>
       </w:r>
     </w:p>
     <w:p>
@@ -2441,7 +2186,7 @@
     </w:p>
     <w:p>
       <w:r>
-        <w:t>Findings in this briefing draw on primary sources read directly wherever possible, with every source tagged by its likely interest (government/official, independent/academic, vendor/commercial, or advocacy/membership body) so that the concentration of the evidence base is visible rather than hidden. Where a finding would materially affect the project's direction, confirming and disconfirming evidence has been sought together rather than assuming the initial hypothesis. A small number of leads referenced during this research (for example, further critical commentary on the AI Skills Hub in the trade press) have not yet been independently verified and are not included as findings here.</w:t>
+        <w:t>Findings here draw on primary sources read directly wherever possible. Every source is tagged by its likely interest — government/official, independent/academic, vendor/commercial, or advocacy/membership body — so the evidence base's concentration is visible, not hidden. Where a finding would materially affect the project's direction, confirming and disconfirming evidence was sought together, not just evidence for the initial hypothesis. A few leads from this research (further critical commentary on the AI Skills Hub in the trade press, for example) haven't been independently verified yet, so they're left out as findings.</w:t>
       </w:r>
     </w:p>
     <w:p>
@@ -2587,7 +2332,7 @@
         <w:spacing w:after="120"/>
       </w:pPr>
       <w:r>
-        <w:t>Innovate UK / Skills England, UK AI Skills Hub (BridgeAI programme), expanded to all UK adults 28 January 2026. aiskillshub.org.uk</w:t>
+        <w:t xml:space="preserve">Innovate UK / Skills England, UK AI Skills Hub (BridgeAI programme), expanded to all UK adults 28 January 2026. aiskillshub.org.uk</w:t>
       </w:r>
     </w:p>
     <w:p>
@@ -2605,7 +2350,7 @@
         <w:spacing w:after="120"/>
       </w:pPr>
       <w:r>
-        <w:t>Quilter, S. (Techosaurus Ltd) &amp; Farmer, E. (Quantum Rise), “We Tested the Government's AI Skills Hub: Five Critical Flaws You Need to Know,” Techosaurus News, 30 January 2026.</w:t>
+        <w:t xml:space="preserve">Quilter, S. (Techosaurus Ltd) &amp; Farmer, E. (Quantum Rise), “We Tested the Government's AI Skills Hub: Five Critical Flaws You Need to Know,” Techosaurus News, 30 January 2026.</w:t>
       </w:r>
     </w:p>
     <w:p>
@@ -2641,7 +2386,7 @@
         <w:spacing w:after="120"/>
       </w:pPr>
       <w:r>
-        <w:t>MinnaLearn &amp; University of Helsinki, Elements of AI. elementsofai.com</w:t>
+        <w:t xml:space="preserve">MinnaLearn &amp; University of Helsinki, Elements of AI. elementsofai.com</w:t>
       </w:r>
     </w:p>
     <w:p>
@@ -2650,7 +2395,7 @@
         <w:spacing w:after="120"/>
       </w:pPr>
       <w:r>
-        <w:t>Kentucky Department of Education, “Evidence-Based Instructional Practices: Explicit Teaching and Modeling” (Gradual Release of Responsibility framework). education.ky.gov</w:t>
+        <w:t xml:space="preserve">Kentucky Department of Education, “Evidence-Based Instructional Practices: Explicit Teaching and Modeling” (Gradual Release of Responsibility framework). education.ky.gov</w:t>
       </w:r>
     </w:p>
     <w:p>

</xml_diff>